<commit_message>
Remove every remaining Aegis reference
Redraw the architecture diagram, rewrite the handover Word/PDF and the
OCI guide PDF (text and links), regenerate the resume test fixtures,
replace the banner mark with the Lapi shield, rebuild the changelog
from the release list, and drop the Aegis-only demo videos, retired
login image and history copies.

Co-Authored-By: Claude Opus 5.5 <noreply@anthropic.com>
Claude-Session: https://claude.ai/code/session_01Mg5PHF2my8rpS55iNezSQ4
</commit_message>
<xml_diff>
--- a/lapi_docs/Lapi_Architecture_Handover.docx
+++ b/lapi_docs/Lapi_Architecture_Handover.docx
@@ -7,7 +7,7 @@
         <w:pStyle w:val="Title"/>
       </w:pPr>
       <w:r>
-        <w:t>Aegis architecture handover</w:t>
+        <w:t>Lapi architecture handover</w:t>
       </w:r>
     </w:p>
     <w:p>
@@ -15,7 +15,7 @@
         <w:widowControl/>
       </w:pPr>
       <w:r>
-        <w:t>Prepared for Swamy. This handover describes Aegis architecture, OCI resources, model placement, running versions and document workflows. Resource and model-mapping facts were inspected read-only on 15 October 2026 at 22:26 IST. Service health and source readiness were checked again on 16 October. Use Aegis_OCI_Deployment_Guide.pdf for the single maintained deployment procedure.</w:t>
+        <w:t>Prepared for Swamy. This handover describes Lapi architecture, OCI resources, model placement, running versions and document workflows. Resource and model-mapping facts were inspected read-only on 15 October 2026 at 22:26 IST. Service health and source readiness were checked again on 16 October. Use Lapi_OCI_Deployment_Guide.pdf for the single maintained deployment procedure.</w:t>
       </w:r>
     </w:p>
     <w:p>
@@ -23,7 +23,7 @@
         <w:widowControl/>
       </w:pPr>
       <w:r>
-        <w:t>Aegis is running on Oracle Cloud Infrastructure in Mumbai. The web application, API, agents, worker and CPU reranker run on OKE. Oracle Autonomous AI Database 26ai stores application records, the durable job queue and native vector knowledge. OCI Object Storage holds the documents and saved result files.</w:t>
+        <w:t>Lapi is running on Oracle Cloud Infrastructure in Mumbai. The web application, API, agents, worker and CPU reranker run on OKE. Oracle Autonomous AI Database 26ai stores application records, the durable job queue and native vector knowledge. OCI Object Storage holds the documents and saved result files.</w:t>
       </w:r>
     </w:p>
     <w:p>
@@ -463,7 +463,7 @@
         <w:widowControl/>
       </w:pPr>
       <w:r>
-        <w:t>The public HTTPS application returned 200. Both application deployments had one ready replica, and all five application containers were ready with zero restarts. The later read-only health check confirmed the same live images, pod identities and restart counts. No release, configuration change, document upload or model inference was performed. The manager branch is ags_sprint1; the immutable original source freeze is aegis-freeze-2026-10-15.</w:t>
+        <w:t>The public HTTPS application returned 200. Both application deployments had one ready replica, and all five application containers were ready with zero restarts. The later read-only health check confirmed the same live images, pod identities and restart counts. No release, configuration change, document upload or model inference was performed. The manager branch is lapi_sprint1; the immutable original source freeze is lapi-freeze-2026-10-15.</w:t>
       </w:r>
     </w:p>
     <w:p>
@@ -503,7 +503,7 @@
               <a:graphicData uri="http://schemas.openxmlformats.org/drawingml/2006/picture">
                 <pic:pic>
                   <pic:nvPicPr>
-                    <pic:cNvPr id="0" name="aegis-architecture.png"/>
+                    <pic:cNvPr id="0" name="lapi-architecture.png"/>
                     <pic:cNvPicPr/>
                   </pic:nvPicPr>
                   <pic:blipFill>
@@ -854,7 +854,7 @@
                 <w:color w:val="000000"/>
                 <w:sz w:val="20"/>
               </w:rPr>
-              <w:t>ags-aegis-basic; Basic; Kubernetes v1.36.4</w:t>
+              <w:t>lapi-basic; Basic; Kubernetes v1.36.4</w:t>
             </w:r>
           </w:p>
         </w:tc>
@@ -956,7 +956,7 @@
                 <w:color w:val="000000"/>
                 <w:sz w:val="20"/>
               </w:rPr>
-              <w:t>ags-aegis-a1-node-pool; 1 node</w:t>
+              <w:t>lapi-a1-node-pool; 1 node</w:t>
             </w:r>
           </w:p>
         </w:tc>
@@ -1160,7 +1160,7 @@
                 <w:color w:val="000000"/>
                 <w:sz w:val="20"/>
               </w:rPr>
-              <w:t>ags_ora_db / agsora; Oracle 26ai; 1 ECPU; 20 GB</w:t>
+              <w:t>lapi_ora_db / lapiora; Oracle 26ai; 1 ECPU; 20 GB</w:t>
             </w:r>
           </w:p>
         </w:tc>
@@ -1364,7 +1364,7 @@
                 <w:color w:val="000000"/>
                 <w:sz w:val="20"/>
               </w:rPr>
-              <w:t>mk-aegis; Standard; namespace bmyljaecivrj</w:t>
+              <w:t>mk-lapi; Standard; namespace bmyljaecivrj</w:t>
             </w:r>
           </w:p>
         </w:tc>
@@ -1874,7 +1874,7 @@
                 <w:color w:val="000000"/>
                 <w:sz w:val="20"/>
               </w:rPr>
-              <w:t>ags-aegis-web, ags-aegis-backend, ags-aegis-ssh</w:t>
+              <w:t>lapi-web, lapi-backend, lapi-ssh</w:t>
             </w:r>
           </w:p>
         </w:tc>
@@ -1943,7 +1943,7 @@
         <w:widowControl/>
       </w:pPr>
       <w:r>
-        <w:t>Deployment aegis-web contains web and https. Deployment aegis-api-worker contains api, worker and model-relay. Each deployment has one desired replica and one ready replica. Both use Recreate for updates.</w:t>
+        <w:t>Deployment lapi-web contains web and https. Deployment lapi-api-worker contains api, worker and model-relay. Each deployment has one desired replica and one ready replica. Both use Recreate for updates.</w:t>
       </w:r>
     </w:p>
     <w:p>
@@ -2596,7 +2596,7 @@
         <w:t xml:space="preserve">1  Database connection. </w:t>
       </w:r>
       <w:r>
-        <w:t>The active destination is OCI database agsora through wallet alias agsora_low, using mTLS. The configured search provider is oracle and the queue provider is database.</w:t>
+        <w:t>The active destination is OCI database lapiora through wallet alias lapiora_low, using mTLS. The configured search provider is oracle and the queue provider is database.</w:t>
       </w:r>
     </w:p>
     <w:p>
@@ -2610,7 +2610,7 @@
         <w:t xml:space="preserve">2  Content connection. </w:t>
       </w:r>
       <w:r>
-        <w:t>The active content destination is OCI Object Storage bucket mk-aegis in namespace bmyljaecivrj. Originals, parsed content, prompts and versioned results keep their saved storage routes.</w:t>
+        <w:t>The active content destination is OCI Object Storage bucket mk-lapi in namespace bmyljaecivrj. Originals, parsed content, prompts and versioned results keep their saved storage routes.</w:t>
       </w:r>
     </w:p>
     <w:p>
@@ -3487,7 +3487,7 @@
         <w:t xml:space="preserve">7  Unified Chat. </w:t>
       </w:r>
       <w:r>
-        <w:t>Every question follows access and scope checks, hybrid vector and keyword retrieval, CPU reranking, Gemini answer generation, and answer/citation validation. Aegis help follows the same retrieval path. Exact counts use complete authorized catalog facts.</w:t>
+        <w:t>Every question follows access and scope checks, hybrid vector and keyword retrieval, CPU reranking, Gemini answer generation, and answer/citation validation. Lapi help follows the same retrieval path. Exact counts use complete authorized catalog facts.</w:t>
       </w:r>
     </w:p>
     <w:p>
@@ -4700,7 +4700,7 @@
         <w:widowControl/>
       </w:pPr>
       <w:r>
-        <w:t>The VCN is ags-aegis-vcn with CIDR 10.42.0.0/16. Its API, worker and load-balancer subnets are 10.42.0.0/24, 10.42.1.0/24 and 10.42.2.0/24. The load balancer exposes ports 80 and 443 at 92.4.67.183. The application uses HTTPS and returned the HSTS header.</w:t>
+        <w:t>The VCN is lapi-vcn with CIDR 10.42.0.0/16. Its API, worker and load-balancer subnets are 10.42.0.0/24, 10.42.1.0/24 and 10.42.2.0/24. The load balancer exposes ports 80 and 443 at 92.4.67.183. The application uses HTTPS and returned the HSTS header.</w:t>
       </w:r>
     </w:p>
     <w:p>
@@ -4777,7 +4777,7 @@
         <w:widowControl/>
       </w:pPr>
       <w:r>
-        <w:t>The application contracts are recorded in root AGENTS.md and the release skill at .agents/skills/aegis-release/SKILL.md. Every Unified Chat question must enforce access and scope, retrieve using semantic and keyword evidence, rerank, generate and validate the answer and citations. Exact counts require complete authorized facts. Do not change the processing agents to implement a chat-only feature.</w:t>
+        <w:t>The application contracts are recorded in root AGENTS.md and the release skill at .agents/skills/lapi-release/SKILL.md. Every Unified Chat question must enforce access and scope, retrieve using semantic and keyword evidence, rerank, generate and validate the answer and citations. Exact counts require complete authorized facts. Do not change the processing agents to implement a chat-only feature.</w:t>
       </w:r>
     </w:p>
     <w:p>
@@ -4785,7 +4785,7 @@
         <w:widowControl/>
       </w:pPr>
       <w:r>
-        <w:t>Use ags_frontend/app/workflow-stepper.tsx and its shared stylesheet for real progress. Completed stages are blue with white checks; an active stage uses a navy rotating ring and particles only on its incoming completed connector. Pending stages remain static. Labels and times describe actual server events; never fabricate percentages, stages or completion. Preserve failure states, keyboard inspection, responsive fitting and reduced-motion behavior.</w:t>
+        <w:t>Use lapi_frontend/app/workflow-stepper.tsx and its shared stylesheet for real progress. Completed stages are blue with white checks; an active stage uses a navy rotating ring and particles only on its incoming completed connector. Pending stages remain static. Labels and times describe actual server events; never fabricate percentages, stages or completion. Preserve failure states, keyboard inspection, responsive fitting and reduced-motion behavior.</w:t>
       </w:r>
     </w:p>
     <w:p>
@@ -4793,7 +4793,7 @@
         <w:widowControl/>
       </w:pPr>
       <w:r>
-        <w:t>Use ags_frontend/app/agent-logo.tsx for Agent identity and preserve the existing platform mark in the header. Earlier design reference images remain in Git history. The recently finalized Mural diagram is embedded in this document and requires no external assets.</w:t>
+        <w:t>Use lapi_frontend/app/agent-logo.tsx for Agent identity and preserve the existing platform mark in the header. Earlier design reference images remain in Git history. The recently finalized Mural diagram is embedded in this document and requires no external assets.</w:t>
       </w:r>
     </w:p>
     <w:p>
@@ -4801,7 +4801,7 @@
         <w:widowControl/>
       </w:pPr>
       <w:r>
-        <w:t>Runtime values come from ags_backend/ags_app/ags_config/runtime.toml; saved model registrations can impose smaller limits. Keep credentials, bootstrap tokens, wallets and deployment receipts out of Git. Source-declared versions and observed container versions are separate facts.</w:t>
+        <w:t>Runtime values come from lapi_backend/lapi_app/lapi_config/runtime.toml; saved model registrations can impose smaller limits. Keep credentials, bootstrap tokens, wallets and deployment receipts out of Git. Source-declared versions and observed container versions are separate facts.</w:t>
       </w:r>
     </w:p>
     <w:tbl>
@@ -4917,7 +4917,7 @@
                 <w:color w:val="000000"/>
                 <w:sz w:val="20"/>
               </w:rPr>
-              <w:t>ags_backend/ags_app</w:t>
+              <w:t>lapi_backend/lapi_app</w:t>
             </w:r>
           </w:p>
         </w:tc>
@@ -4986,7 +4986,7 @@
                 <w:color w:val="000000"/>
                 <w:sz w:val="20"/>
               </w:rPr>
-              <w:t>ags_frontend/app</w:t>
+              <w:t>lapi_frontend/app</w:t>
             </w:r>
           </w:p>
         </w:tc>
@@ -5055,7 +5055,7 @@
                 <w:color w:val="000000"/>
                 <w:sz w:val="20"/>
               </w:rPr>
-              <w:t>ags_database</w:t>
+              <w:t>lapi_database</w:t>
             </w:r>
           </w:p>
         </w:tc>
@@ -5124,7 +5124,7 @@
                 <w:color w:val="000000"/>
                 <w:sz w:val="20"/>
               </w:rPr>
-              <w:t>ags_deploy</w:t>
+              <w:t>lapi_deploy</w:t>
             </w:r>
           </w:p>
         </w:tc>
@@ -5193,7 +5193,7 @@
                 <w:color w:val="000000"/>
                 <w:sz w:val="20"/>
               </w:rPr>
-              <w:t>ags_local_use</w:t>
+              <w:t>lapi_local_use</w:t>
             </w:r>
           </w:p>
         </w:tc>
@@ -5262,7 +5262,7 @@
                 <w:color w:val="000000"/>
                 <w:sz w:val="20"/>
               </w:rPr>
-              <w:t>ags_testing</w:t>
+              <w:t>lapi_testing</w:t>
             </w:r>
           </w:p>
         </w:tc>
@@ -5310,7 +5310,7 @@
         <w:widowControl/>
       </w:pPr>
       <w:r>
-        <w:t>For a separate local installation, use ags_local_use/ags_scripts/setup.sh and ags_local_use/compose.yaml, or the Windows Oracle launcher ags_local_use/ags_scripts/start-oracle.ps1. Use independent data and secrets. These development alternatives do not describe the live OCI topology. Root README links this architecture reference and the single final OCI deployment PDF.</w:t>
+        <w:t>For a separate local installation, use lapi_local_use/lapi_scripts/setup.sh and lapi_local_use/compose.yaml, or the Windows Oracle launcher lapi_local_use/lapi_scripts/start-oracle.ps1. Use independent data and secrets. These development alternatives do not describe the live OCI topology. Root README links this architecture reference and the single final OCI deployment PDF.</w:t>
       </w:r>
     </w:p>
     <w:p>
@@ -5331,7 +5331,7 @@
         <w:widowControl/>
       </w:pPr>
       <w:r>
-        <w:t>The final handover branch is ags_sprint1, created from the python source freeze. Tag aegis-freeze-2026-10-15 remains unchanged. The tag identifies source, not proof that the deployed images are byte-for-byte builds of that commit. The source-only manifest at the tag fingerprints 481 inputs; later documentation and folder changes on ags_sprint1 do not redeploy the application.</w:t>
+        <w:t>The final handover branch is lapi_sprint1, created from the python source freeze. Tag lapi-freeze-2026-10-15 remains unchanged. The tag identifies source, not proof that the deployed images are byte-for-byte builds of that commit. The source-only manifest at the tag fingerprints 481 inputs; later documentation and folder changes on lapi_sprint1 do not redeploy the application.</w:t>
       </w:r>
     </w:p>
     <w:tbl>
@@ -5540,7 +5540,7 @@
                 <w:color w:val="000000"/>
                 <w:sz w:val="20"/>
               </w:rPr>
-              <w:t>Tests, fixtures and QA tools are under ags_testing; imports, CI, Compose and container paths verified</w:t>
+              <w:t>Tests, fixtures and QA tools are under lapi_testing; imports, CI, Compose and container paths verified</w:t>
             </w:r>
           </w:p>
         </w:tc>
@@ -5877,7 +5877,7 @@
         <w:widowControl/>
       </w:pPr>
       <w:r>
-        <w:t>GitHub Actions triggers on main pushes and pull requests. A direct push to ags_sprint1 is not a fresh CI run and does not deploy the application. The verified application/tooling baseline is 3ae03a5f40fa24bd7c05f84892a9d73efddc677d. No new-tenancy installation, live provider inference, upload/extraction/chat write test or recovery drill was performed.</w:t>
+        <w:t>GitHub Actions triggers on main pushes and pull requests. A direct push to lapi_sprint1 is not a fresh CI run and does not deploy the application. The verified application/tooling baseline is 3ae03a5f40fa24bd7c05f84892a9d73efddc677d. No new-tenancy installation, live provider inference, upload/extraction/chat write test or recovery drill was performed.</w:t>
       </w:r>
     </w:p>
     <w:p>
@@ -5885,7 +5885,7 @@
         <w:widowControl/>
       </w:pPr>
       <w:r>
-        <w:t>Superseded deployment guides and earlier handover versions are archived under delete/ with their original paths. Aegis_OCI_Deployment_Guide.pdf is the current deployment authority for both the AI skill and JSON plus PowerShell routes. Resource observations retain their inspection timestamps; no live settings were changed for this handover.</w:t>
+        <w:t>Superseded deployment guides and earlier handover versions are archived under delete/ with their original paths. Lapi_OCI_Deployment_Guide.pdf is the current deployment authority for both the AI skill and JSON plus PowerShell routes. Resource observations retain their inspection timestamps; no live settings were changed for this handover.</w:t>
       </w:r>
     </w:p>
     <w:p>
@@ -5926,7 +5926,7 @@
           <w:sz w:val="18"/>
         </w:rPr>
         <w:br/>
-        <w:t>bom.ocir.io/bmyljaecivrj/ags-aegis-web</w:t>
+        <w:t>bom.ocir.io/bmyljaecivrj/lapi-web</w:t>
       </w:r>
       <w:r>
         <w:rPr>
@@ -5957,7 +5957,7 @@
           <w:sz w:val="18"/>
         </w:rPr>
         <w:br/>
-        <w:t>bom.ocir.io/bmyljaecivrj/ags-aegis-backend</w:t>
+        <w:t>bom.ocir.io/bmyljaecivrj/lapi-backend</w:t>
       </w:r>
       <w:r>
         <w:rPr>
@@ -6004,7 +6004,7 @@
           <w:sz w:val="18"/>
         </w:rPr>
         <w:br/>
-        <w:t>bom.ocir.io/bmyljaecivrj/ags-aegis-ssh</w:t>
+        <w:t>bom.ocir.io/bmyljaecivrj/lapi-ssh</w:t>
       </w:r>
       <w:r>
         <w:rPr>
@@ -6067,7 +6067,7 @@
         <w:widowControl/>
       </w:pPr>
       <w:r>
-        <w:t>Original source manifest: https://github.com/Maniatramco/Aegis/blob/aegis-freeze-2026-10-15/ags_docs/RELEASE-MANIFEST.json</w:t>
+        <w:t>Original source manifest: https://github.com/Maniatramco/Lapi/blob/lapi-freeze-2026-10-15/lapi_docs/RELEASE-MANIFEST.json</w:t>
       </w:r>
     </w:p>
     <w:sectPr>
@@ -6091,7 +6091,7 @@
       <w:rPr>
         <w:sz w:val="18"/>
       </w:rPr>
-      <w:t xml:space="preserve">Aegis architecture  |  </w:t>
+      <w:t xml:space="preserve">Lapi architecture  |  </w:t>
     </w:r>
     <w:fldSimple w:instr="PAGE"/>
   </w:p>

</xml_diff>